<commit_message>
Publish latest CV/resume artifacts and landing
</commit_message>
<xml_diff>
--- a/docs/assets/docx/cv-en.docx
+++ b/docs/assets/docx/cv-en.docx
@@ -5150,12 +5150,331 @@
       </w:r>
     </w:p>
     <w:bookmarkEnd w:id="25"/>
-    <w:bookmarkStart w:id="31" w:name="open-source-projects-mcp"/>
+    <w:bookmarkStart w:id="26" w:name="kb-memory-l0l3-layers-and-domains"/>
     <w:p>
       <w:pPr>
         <w:pStyle w:val="Heading2"/>
       </w:pPr>
       <w:r>
+        <w:t xml:space="preserve">KB memory: L0–L3 layers and domains</w:t>
+      </w:r>
+    </w:p>
+    <w:p>
+      <w:pPr>
+        <w:pStyle w:val="FirstParagraph"/>
+      </w:pPr>
+      <w:r>
+        <w:t xml:space="preserve">A short version of the</w:t>
+      </w:r>
+      <w:r>
+        <w:t xml:space="preserve"> </w:t>
+      </w:r>
+      <w:r>
+        <w:rPr>
+          <w:b/>
+          <w:bCs/>
+        </w:rPr>
+        <w:t xml:space="preserve">layered</w:t>
+      </w:r>
+      <w:r>
+        <w:t xml:space="preserve"> </w:t>
+      </w:r>
+      <w:r>
+        <w:t xml:space="preserve">model and load contract — the same idea as the KB onboarding overview (no full load),</w:t>
+      </w:r>
+      <w:r>
+        <w:t xml:space="preserve"> </w:t>
+      </w:r>
+      <w:r>
+        <w:rPr>
+          <w:b/>
+          <w:bCs/>
+        </w:rPr>
+        <w:t xml:space="preserve">without</w:t>
+      </w:r>
+      <w:r>
+        <w:t xml:space="preserve"> </w:t>
+      </w:r>
+      <w:r>
+        <w:t xml:space="preserve">naming files or paths.</w:t>
+      </w:r>
+    </w:p>
+    <w:p>
+      <w:pPr>
+        <w:pStyle w:val="BodyText"/>
+      </w:pPr>
+      <w:r>
+        <w:rPr>
+          <w:b/>
+          <w:bCs/>
+        </w:rPr>
+        <w:t xml:space="preserve">Mermaid</w:t>
+      </w:r>
+      <w:r>
+        <w:t xml:space="preserve"> </w:t>
+      </w:r>
+      <w:r>
+        <w:t xml:space="preserve">diagrams render in</w:t>
+      </w:r>
+      <w:r>
+        <w:t xml:space="preserve"> </w:t>
+      </w:r>
+      <w:r>
+        <w:rPr>
+          <w:b/>
+          <w:bCs/>
+        </w:rPr>
+        <w:t xml:space="preserve">HTML</w:t>
+      </w:r>
+      <w:r>
+        <w:t xml:space="preserve"> </w:t>
+      </w:r>
+      <w:r>
+        <w:t xml:space="preserve">and in</w:t>
+      </w:r>
+      <w:r>
+        <w:t xml:space="preserve"> </w:t>
+      </w:r>
+      <w:r>
+        <w:rPr>
+          <w:b/>
+          <w:bCs/>
+        </w:rPr>
+        <w:t xml:space="preserve">PDF printed from a browser</w:t>
+      </w:r>
+      <w:r>
+        <w:t xml:space="preserve">;</w:t>
+      </w:r>
+      <w:r>
+        <w:t xml:space="preserve"> </w:t>
+      </w:r>
+      <w:r>
+        <w:rPr>
+          <w:b/>
+          <w:bCs/>
+        </w:rPr>
+        <w:t xml:space="preserve">DOCX</w:t>
+      </w:r>
+      <w:r>
+        <w:t xml:space="preserve"> </w:t>
+      </w:r>
+      <w:r>
+        <w:t xml:space="preserve">usually does not execute JS — the bullet list mirrors the diagrams.</w:t>
+      </w:r>
+    </w:p>
+    <w:p>
+      <w:pPr>
+        <w:pStyle w:val="Compact"/>
+        <w:numPr>
+          <w:ilvl w:val="0"/>
+          <w:numId w:val="1013"/>
+        </w:numPr>
+      </w:pPr>
+      <w:r>
+        <w:rPr>
+          <w:b/>
+          <w:bCs/>
+        </w:rPr>
+        <w:t xml:space="preserve">L0 — always on:</w:t>
+      </w:r>
+      <w:r>
+        <w:t xml:space="preserve"> </w:t>
+      </w:r>
+      <w:r>
+        <w:t xml:space="preserve">integrity, epistemics, core when barriers fail, principled clarity;</w:t>
+      </w:r>
+      <w:r>
+        <w:t xml:space="preserve"> </w:t>
+      </w:r>
+      <w:r>
+        <w:rPr>
+          <w:b/>
+          <w:bCs/>
+        </w:rPr>
+        <w:t xml:space="preserve">not</w:t>
+      </w:r>
+      <w:r>
+        <w:t xml:space="preserve"> </w:t>
+      </w:r>
+      <w:r>
+        <w:t xml:space="preserve">tied to the current task.</w:t>
+      </w:r>
+    </w:p>
+    <w:p>
+      <w:pPr>
+        <w:pStyle w:val="Compact"/>
+        <w:numPr>
+          <w:ilvl w:val="0"/>
+          <w:numId w:val="1013"/>
+        </w:numPr>
+      </w:pPr>
+      <w:r>
+        <w:rPr>
+          <w:b/>
+          <w:bCs/>
+        </w:rPr>
+        <w:t xml:space="preserve">L1 — operational memory by scope slices:</w:t>
+      </w:r>
+      <w:r>
+        <w:t xml:space="preserve"> </w:t>
+      </w:r>
+      <w:r>
+        <w:rPr>
+          <w:b/>
+          <w:bCs/>
+        </w:rPr>
+        <w:t xml:space="preserve">status → playbook → matrix → kb</w:t>
+      </w:r>
+      <w:r>
+        <w:t xml:space="preserve">; compact artifacts first, heavy</w:t>
+      </w:r>
+      <w:r>
+        <w:t xml:space="preserve"> </w:t>
+      </w:r>
+      <w:r>
+        <w:rPr>
+          <w:rStyle w:val="VerbatimChar"/>
+        </w:rPr>
+        <w:t xml:space="preserve">kb-*</w:t>
+      </w:r>
+      <w:r>
+        <w:t xml:space="preserve"> </w:t>
+      </w:r>
+      <w:r>
+        <w:t xml:space="preserve">only on explicit request.</w:t>
+      </w:r>
+    </w:p>
+    <w:p>
+      <w:pPr>
+        <w:pStyle w:val="Compact"/>
+        <w:numPr>
+          <w:ilvl w:val="0"/>
+          <w:numId w:val="1013"/>
+        </w:numPr>
+      </w:pPr>
+      <w:r>
+        <w:rPr>
+          <w:b/>
+          <w:bCs/>
+        </w:rPr>
+        <w:t xml:space="preserve">L2 — archive and evidence:</w:t>
+      </w:r>
+      <w:r>
+        <w:t xml:space="preserve"> </w:t>
+      </w:r>
+      <w:r>
+        <w:t xml:space="preserve">revisions, rule batches, evidence docs — when facts are missing or history is needed (no “load everything at session start”).</w:t>
+      </w:r>
+    </w:p>
+    <w:p>
+      <w:pPr>
+        <w:pStyle w:val="Compact"/>
+        <w:numPr>
+          <w:ilvl w:val="0"/>
+          <w:numId w:val="1013"/>
+        </w:numPr>
+      </w:pPr>
+      <w:r>
+        <w:rPr>
+          <w:b/>
+          <w:bCs/>
+        </w:rPr>
+        <w:t xml:space="preserve">L3 — semantics:</w:t>
+      </w:r>
+      <w:r>
+        <w:t xml:space="preserve"> </w:t>
+      </w:r>
+      <w:r>
+        <w:t xml:space="preserve">routing by</w:t>
+      </w:r>
+      <w:r>
+        <w:t xml:space="preserve"> </w:t>
+      </w:r>
+      <w:r>
+        <w:rPr>
+          <w:b/>
+          <w:bCs/>
+        </w:rPr>
+        <w:t xml:space="preserve">context facets</w:t>
+      </w:r>
+      <w:r>
+        <w:t xml:space="preserve">; moving between</w:t>
+      </w:r>
+      <w:r>
+        <w:t xml:space="preserve"> </w:t>
+      </w:r>
+      <w:r>
+        <w:rPr>
+          <w:b/>
+          <w:bCs/>
+        </w:rPr>
+        <w:t xml:space="preserve">worlds</w:t>
+      </w:r>
+      <w:r>
+        <w:t xml:space="preserve"> </w:t>
+      </w:r>
+      <w:r>
+        <w:t xml:space="preserve">(domains) only through</w:t>
+      </w:r>
+      <w:r>
+        <w:t xml:space="preserve"> </w:t>
+      </w:r>
+      <w:r>
+        <w:rPr>
+          <w:b/>
+          <w:bCs/>
+        </w:rPr>
+        <w:t xml:space="preserve">explicit boundaries</w:t>
+      </w:r>
+      <w:r>
+        <w:t xml:space="preserve">.</w:t>
+      </w:r>
+    </w:p>
+    <w:p>
+      <w:pPr>
+        <w:pStyle w:val="Compact"/>
+        <w:numPr>
+          <w:ilvl w:val="0"/>
+          <w:numId w:val="1013"/>
+        </w:numPr>
+      </w:pPr>
+      <w:r>
+        <w:rPr>
+          <w:b/>
+          <w:bCs/>
+        </w:rPr>
+        <w:t xml:space="preserve">Domains and glue:</w:t>
+      </w:r>
+      <w:r>
+        <w:t xml:space="preserve"> </w:t>
+      </w:r>
+      <w:r>
+        <w:t xml:space="preserve">Git, PR review, HCI, Developer Experience, IT, Knowledge Engineering, psychology, aviation, reading, integrity under pressure, etc. — tied together by a</w:t>
+      </w:r>
+      <w:r>
+        <w:t xml:space="preserve"> </w:t>
+      </w:r>
+      <w:r>
+        <w:rPr>
+          <w:b/>
+          <w:bCs/>
+        </w:rPr>
+        <w:t xml:space="preserve">single index</w:t>
+      </w:r>
+      <w:r>
+        <w:t xml:space="preserve"> </w:t>
+      </w:r>
+      <w:r>
+        <w:t xml:space="preserve">and the same load contract.</w:t>
+      </w:r>
+    </w:p>
+    <w:bookmarkEnd w:id="26"/>
+    <w:bookmarkStart w:id="32" w:name="open-source-projects-mcp"/>
+    <w:p>
+      <w:pPr>
+        <w:pStyle w:val="Heading2"/>
+      </w:pPr>
+      <w:r>
         <w:t xml:space="preserve">Open-source projects (MCP)</w:t>
       </w:r>
     </w:p>
@@ -5193,7 +5512,7 @@
       <w:r>
         <w:t xml:space="preserve"> </w:t>
       </w:r>
-      <w:hyperlink r:id="rId26">
+      <w:hyperlink r:id="rId27">
         <w:r>
           <w:rPr>
             <w:rStyle w:val="Hyperlink"/>
@@ -5209,10 +5528,10 @@
       <w:pPr>
         <w:numPr>
           <w:ilvl w:val="0"/>
-          <w:numId w:val="1013"/>
-        </w:numPr>
-      </w:pPr>
-      <w:hyperlink r:id="rId27">
+          <w:numId w:val="1014"/>
+        </w:numPr>
+      </w:pPr>
+      <w:hyperlink r:id="rId28">
         <w:r>
           <w:rPr>
             <w:rStyle w:val="Hyperlink"/>
@@ -5250,168 +5569,168 @@
         <w:pStyle w:val="Compact"/>
         <w:numPr>
           <w:ilvl w:val="1"/>
+          <w:numId w:val="1015"/>
+        </w:numPr>
+      </w:pPr>
+      <w:r>
+        <w:rPr>
+          <w:b/>
+          <w:bCs/>
+        </w:rPr>
+        <w:t xml:space="preserve">Purpose:</w:t>
+      </w:r>
+      <w:r>
+        <w:t xml:space="preserve"> </w:t>
+      </w:r>
+      <w:r>
+        <w:t xml:space="preserve">give the model the same code-analysis layer as the IDE (Roslyn), not only file text.</w:t>
+      </w:r>
+    </w:p>
+    <w:p>
+      <w:pPr>
+        <w:pStyle w:val="Compact"/>
+        <w:numPr>
+          <w:ilvl w:val="1"/>
+          <w:numId w:val="1015"/>
+        </w:numPr>
+      </w:pPr>
+      <w:r>
+        <w:rPr>
+          <w:b/>
+          <w:bCs/>
+        </w:rPr>
+        <w:t xml:space="preserve">Motivation:</w:t>
+      </w:r>
+      <w:r>
+        <w:t xml:space="preserve"> </w:t>
+      </w:r>
+      <w:r>
+        <w:t xml:space="preserve">fewer edits that break the build and less API guessing without compiler checks.</w:t>
+      </w:r>
+    </w:p>
+    <w:p>
+      <w:pPr>
+        <w:pStyle w:val="Compact"/>
+        <w:numPr>
+          <w:ilvl w:val="1"/>
+          <w:numId w:val="1015"/>
+        </w:numPr>
+      </w:pPr>
+      <w:r>
+        <w:rPr>
+          <w:b/>
+          <w:bCs/>
+        </w:rPr>
+        <w:t xml:space="preserve">Vision:</w:t>
+      </w:r>
+      <w:r>
+        <w:t xml:space="preserve"> </w:t>
+      </w:r>
+      <w:r>
+        <w:t xml:space="preserve">main C# workflow in Cursor where MCP is connected: diagnostics → code actions → apply, symbol navigation.</w:t>
+      </w:r>
+    </w:p>
+    <w:p>
+      <w:pPr>
+        <w:pStyle w:val="Compact"/>
+        <w:numPr>
+          <w:ilvl w:val="1"/>
+          <w:numId w:val="1015"/>
+        </w:numPr>
+      </w:pPr>
+      <w:r>
+        <w:rPr>
+          <w:b/>
+          <w:bCs/>
+        </w:rPr>
+        <w:t xml:space="preserve">Scope:</w:t>
+      </w:r>
+      <w:r>
+        <w:t xml:space="preserve"> </w:t>
+      </w:r>
+      <w:r>
+        <w:t xml:space="preserve">solution/project, open documents, Roslyn operations (within server capabilities).</w:t>
+      </w:r>
+    </w:p>
+    <w:p>
+      <w:pPr>
+        <w:pStyle w:val="Compact"/>
+        <w:numPr>
+          <w:ilvl w:val="1"/>
+          <w:numId w:val="1015"/>
+        </w:numPr>
+      </w:pPr>
+      <w:r>
+        <w:rPr>
+          <w:b/>
+          <w:bCs/>
+        </w:rPr>
+        <w:t xml:space="preserve">Non-goals:</w:t>
+      </w:r>
+      <w:r>
+        <w:t xml:space="preserve"> </w:t>
+      </w:r>
+      <w:r>
+        <w:t xml:space="preserve">replacing a full IDE, running apps, debugging (other MCPs).</w:t>
+      </w:r>
+    </w:p>
+    <w:p>
+      <w:pPr>
+        <w:pStyle w:val="Compact"/>
+        <w:numPr>
+          <w:ilvl w:val="1"/>
+          <w:numId w:val="1015"/>
+        </w:numPr>
+      </w:pPr>
+      <w:r>
+        <w:rPr>
+          <w:b/>
+          <w:bCs/>
+        </w:rPr>
+        <w:t xml:space="preserve">For the agent:</w:t>
+      </w:r>
+      <w:r>
+        <w:t xml:space="preserve"> </w:t>
+      </w:r>
+      <w:r>
+        <w:t xml:space="preserve">on errors/warnings use</w:t>
+      </w:r>
+      <w:r>
+        <w:t xml:space="preserve"> </w:t>
+      </w:r>
+      <w:r>
+        <w:rPr>
+          <w:rStyle w:val="VerbatimChar"/>
+        </w:rPr>
+        <w:t xml:space="preserve">roslyn_get_diagnostics</w:t>
+      </w:r>
+      <w:r>
+        <w:t xml:space="preserve"> </w:t>
+      </w:r>
+      <w:r>
+        <w:t xml:space="preserve">and code actions, not only</w:t>
+      </w:r>
+      <w:r>
+        <w:t xml:space="preserve"> </w:t>
+      </w:r>
+      <w:r>
+        <w:rPr>
+          <w:rStyle w:val="VerbatimChar"/>
+        </w:rPr>
+        <w:t xml:space="preserve">dotnet build</w:t>
+      </w:r>
+      <w:r>
+        <w:t xml:space="preserve">; tool positions are 1-based; do not treat text grep as a substitute for semantics.</w:t>
+      </w:r>
+    </w:p>
+    <w:p>
+      <w:pPr>
+        <w:numPr>
+          <w:ilvl w:val="0"/>
           <w:numId w:val="1014"/>
         </w:numPr>
       </w:pPr>
-      <w:r>
-        <w:rPr>
-          <w:b/>
-          <w:bCs/>
-        </w:rPr>
-        <w:t xml:space="preserve">Purpose:</w:t>
-      </w:r>
-      <w:r>
-        <w:t xml:space="preserve"> </w:t>
-      </w:r>
-      <w:r>
-        <w:t xml:space="preserve">give the model the same code-analysis layer as the IDE (Roslyn), not only file text.</w:t>
-      </w:r>
-    </w:p>
-    <w:p>
-      <w:pPr>
-        <w:pStyle w:val="Compact"/>
-        <w:numPr>
-          <w:ilvl w:val="1"/>
-          <w:numId w:val="1014"/>
-        </w:numPr>
-      </w:pPr>
-      <w:r>
-        <w:rPr>
-          <w:b/>
-          <w:bCs/>
-        </w:rPr>
-        <w:t xml:space="preserve">Motivation:</w:t>
-      </w:r>
-      <w:r>
-        <w:t xml:space="preserve"> </w:t>
-      </w:r>
-      <w:r>
-        <w:t xml:space="preserve">fewer edits that break the build and less API guessing without compiler checks.</w:t>
-      </w:r>
-    </w:p>
-    <w:p>
-      <w:pPr>
-        <w:pStyle w:val="Compact"/>
-        <w:numPr>
-          <w:ilvl w:val="1"/>
-          <w:numId w:val="1014"/>
-        </w:numPr>
-      </w:pPr>
-      <w:r>
-        <w:rPr>
-          <w:b/>
-          <w:bCs/>
-        </w:rPr>
-        <w:t xml:space="preserve">Vision:</w:t>
-      </w:r>
-      <w:r>
-        <w:t xml:space="preserve"> </w:t>
-      </w:r>
-      <w:r>
-        <w:t xml:space="preserve">main C# workflow in Cursor where MCP is connected: diagnostics → code actions → apply, symbol navigation.</w:t>
-      </w:r>
-    </w:p>
-    <w:p>
-      <w:pPr>
-        <w:pStyle w:val="Compact"/>
-        <w:numPr>
-          <w:ilvl w:val="1"/>
-          <w:numId w:val="1014"/>
-        </w:numPr>
-      </w:pPr>
-      <w:r>
-        <w:rPr>
-          <w:b/>
-          <w:bCs/>
-        </w:rPr>
-        <w:t xml:space="preserve">Scope:</w:t>
-      </w:r>
-      <w:r>
-        <w:t xml:space="preserve"> </w:t>
-      </w:r>
-      <w:r>
-        <w:t xml:space="preserve">solution/project, open documents, Roslyn operations (within server capabilities).</w:t>
-      </w:r>
-    </w:p>
-    <w:p>
-      <w:pPr>
-        <w:pStyle w:val="Compact"/>
-        <w:numPr>
-          <w:ilvl w:val="1"/>
-          <w:numId w:val="1014"/>
-        </w:numPr>
-      </w:pPr>
-      <w:r>
-        <w:rPr>
-          <w:b/>
-          <w:bCs/>
-        </w:rPr>
-        <w:t xml:space="preserve">Non-goals:</w:t>
-      </w:r>
-      <w:r>
-        <w:t xml:space="preserve"> </w:t>
-      </w:r>
-      <w:r>
-        <w:t xml:space="preserve">replacing a full IDE, running apps, debugging (other MCPs).</w:t>
-      </w:r>
-    </w:p>
-    <w:p>
-      <w:pPr>
-        <w:pStyle w:val="Compact"/>
-        <w:numPr>
-          <w:ilvl w:val="1"/>
-          <w:numId w:val="1014"/>
-        </w:numPr>
-      </w:pPr>
-      <w:r>
-        <w:rPr>
-          <w:b/>
-          <w:bCs/>
-        </w:rPr>
-        <w:t xml:space="preserve">For the agent:</w:t>
-      </w:r>
-      <w:r>
-        <w:t xml:space="preserve"> </w:t>
-      </w:r>
-      <w:r>
-        <w:t xml:space="preserve">on errors/warnings use</w:t>
-      </w:r>
-      <w:r>
-        <w:t xml:space="preserve"> </w:t>
-      </w:r>
-      <w:r>
-        <w:rPr>
-          <w:rStyle w:val="VerbatimChar"/>
-        </w:rPr>
-        <w:t xml:space="preserve">roslyn_get_diagnostics</w:t>
-      </w:r>
-      <w:r>
-        <w:t xml:space="preserve"> </w:t>
-      </w:r>
-      <w:r>
-        <w:t xml:space="preserve">and code actions, not only</w:t>
-      </w:r>
-      <w:r>
-        <w:t xml:space="preserve"> </w:t>
-      </w:r>
-      <w:r>
-        <w:rPr>
-          <w:rStyle w:val="VerbatimChar"/>
-        </w:rPr>
-        <w:t xml:space="preserve">dotnet build</w:t>
-      </w:r>
-      <w:r>
-        <w:t xml:space="preserve">; tool positions are 1-based; do not treat text grep as a substitute for semantics.</w:t>
-      </w:r>
-    </w:p>
-    <w:p>
-      <w:pPr>
-        <w:numPr>
-          <w:ilvl w:val="0"/>
-          <w:numId w:val="1013"/>
-        </w:numPr>
-      </w:pPr>
-      <w:hyperlink r:id="rId28">
+      <w:hyperlink r:id="rId29">
         <w:r>
           <w:rPr>
             <w:rStyle w:val="Hyperlink"/>
@@ -5449,7 +5768,7 @@
         <w:pStyle w:val="Compact"/>
         <w:numPr>
           <w:ilvl w:val="1"/>
-          <w:numId w:val="1015"/>
+          <w:numId w:val="1016"/>
         </w:numPr>
       </w:pPr>
       <w:r>
@@ -5471,7 +5790,7 @@
         <w:pStyle w:val="Compact"/>
         <w:numPr>
           <w:ilvl w:val="1"/>
-          <w:numId w:val="1015"/>
+          <w:numId w:val="1016"/>
         </w:numPr>
       </w:pPr>
       <w:r>
@@ -5493,7 +5812,7 @@
         <w:pStyle w:val="Compact"/>
         <w:numPr>
           <w:ilvl w:val="1"/>
-          <w:numId w:val="1015"/>
+          <w:numId w:val="1016"/>
         </w:numPr>
       </w:pPr>
       <w:r>
@@ -5527,7 +5846,7 @@
         <w:pStyle w:val="Compact"/>
         <w:numPr>
           <w:ilvl w:val="1"/>
-          <w:numId w:val="1015"/>
+          <w:numId w:val="1016"/>
         </w:numPr>
       </w:pPr>
       <w:r>
@@ -5549,7 +5868,7 @@
         <w:pStyle w:val="Compact"/>
         <w:numPr>
           <w:ilvl w:val="1"/>
-          <w:numId w:val="1015"/>
+          <w:numId w:val="1016"/>
         </w:numPr>
       </w:pPr>
       <w:r>
@@ -5571,7 +5890,7 @@
         <w:pStyle w:val="Compact"/>
         <w:numPr>
           <w:ilvl w:val="1"/>
-          <w:numId w:val="1015"/>
+          <w:numId w:val="1016"/>
         </w:numPr>
       </w:pPr>
       <w:r>
@@ -5601,10 +5920,10 @@
       <w:pPr>
         <w:numPr>
           <w:ilvl w:val="0"/>
-          <w:numId w:val="1013"/>
-        </w:numPr>
-      </w:pPr>
-      <w:hyperlink r:id="rId29">
+          <w:numId w:val="1014"/>
+        </w:numPr>
+      </w:pPr>
+      <w:hyperlink r:id="rId30">
         <w:r>
           <w:rPr>
             <w:rStyle w:val="Hyperlink"/>
@@ -5672,7 +5991,7 @@
         <w:pStyle w:val="Compact"/>
         <w:numPr>
           <w:ilvl w:val="1"/>
-          <w:numId w:val="1016"/>
+          <w:numId w:val="1017"/>
         </w:numPr>
       </w:pPr>
       <w:r>
@@ -5694,7 +6013,7 @@
         <w:pStyle w:val="Compact"/>
         <w:numPr>
           <w:ilvl w:val="1"/>
-          <w:numId w:val="1016"/>
+          <w:numId w:val="1017"/>
         </w:numPr>
       </w:pPr>
       <w:r>
@@ -5716,7 +6035,7 @@
         <w:pStyle w:val="Compact"/>
         <w:numPr>
           <w:ilvl w:val="1"/>
-          <w:numId w:val="1016"/>
+          <w:numId w:val="1017"/>
         </w:numPr>
       </w:pPr>
       <w:r>
@@ -5738,7 +6057,7 @@
         <w:pStyle w:val="Compact"/>
         <w:numPr>
           <w:ilvl w:val="1"/>
-          <w:numId w:val="1016"/>
+          <w:numId w:val="1017"/>
         </w:numPr>
       </w:pPr>
       <w:r>
@@ -5778,7 +6097,7 @@
         <w:pStyle w:val="Compact"/>
         <w:numPr>
           <w:ilvl w:val="1"/>
-          <w:numId w:val="1016"/>
+          <w:numId w:val="1017"/>
         </w:numPr>
       </w:pPr>
       <w:r>
@@ -5800,7 +6119,7 @@
         <w:pStyle w:val="Compact"/>
         <w:numPr>
           <w:ilvl w:val="1"/>
-          <w:numId w:val="1016"/>
+          <w:numId w:val="1017"/>
         </w:numPr>
       </w:pPr>
       <w:r>
@@ -5848,10 +6167,10 @@
       <w:pPr>
         <w:numPr>
           <w:ilvl w:val="0"/>
-          <w:numId w:val="1013"/>
-        </w:numPr>
-      </w:pPr>
-      <w:hyperlink r:id="rId30">
+          <w:numId w:val="1014"/>
+        </w:numPr>
+      </w:pPr>
+      <w:hyperlink r:id="rId31">
         <w:r>
           <w:rPr>
             <w:rStyle w:val="Hyperlink"/>
@@ -5889,7 +6208,7 @@
         <w:pStyle w:val="Compact"/>
         <w:numPr>
           <w:ilvl w:val="1"/>
-          <w:numId w:val="1017"/>
+          <w:numId w:val="1018"/>
         </w:numPr>
       </w:pPr>
       <w:r>
@@ -5911,7 +6230,7 @@
         <w:pStyle w:val="Compact"/>
         <w:numPr>
           <w:ilvl w:val="1"/>
-          <w:numId w:val="1017"/>
+          <w:numId w:val="1018"/>
         </w:numPr>
       </w:pPr>
       <w:r>
@@ -5933,7 +6252,7 @@
         <w:pStyle w:val="Compact"/>
         <w:numPr>
           <w:ilvl w:val="1"/>
-          <w:numId w:val="1017"/>
+          <w:numId w:val="1018"/>
         </w:numPr>
       </w:pPr>
       <w:r>
@@ -5955,7 +6274,7 @@
         <w:pStyle w:val="Compact"/>
         <w:numPr>
           <w:ilvl w:val="1"/>
-          <w:numId w:val="1017"/>
+          <w:numId w:val="1018"/>
         </w:numPr>
       </w:pPr>
       <w:r>
@@ -5977,7 +6296,7 @@
         <w:pStyle w:val="Compact"/>
         <w:numPr>
           <w:ilvl w:val="1"/>
-          <w:numId w:val="1017"/>
+          <w:numId w:val="1018"/>
         </w:numPr>
       </w:pPr>
       <w:r>
@@ -5999,7 +6318,7 @@
         <w:pStyle w:val="Compact"/>
         <w:numPr>
           <w:ilvl w:val="1"/>
-          <w:numId w:val="1017"/>
+          <w:numId w:val="1018"/>
         </w:numPr>
       </w:pPr>
       <w:r>
@@ -6036,8 +6355,8 @@
         <w:t xml:space="preserve">Licenses and details are in each repository’s README.</w:t>
       </w:r>
     </w:p>
-    <w:bookmarkEnd w:id="31"/>
-    <w:bookmarkStart w:id="32" w:name="additional-information"/>
+    <w:bookmarkEnd w:id="32"/>
+    <w:bookmarkStart w:id="33" w:name="additional-information"/>
     <w:p>
       <w:pPr>
         <w:pStyle w:val="Heading2"/>
@@ -6107,7 +6426,7 @@
         <w:pStyle w:val="Compact"/>
         <w:numPr>
           <w:ilvl w:val="0"/>
-          <w:numId w:val="1018"/>
+          <w:numId w:val="1019"/>
         </w:numPr>
       </w:pPr>
       <w:r>
@@ -6119,7 +6438,7 @@
         <w:pStyle w:val="Compact"/>
         <w:numPr>
           <w:ilvl w:val="0"/>
-          <w:numId w:val="1018"/>
+          <w:numId w:val="1019"/>
         </w:numPr>
       </w:pPr>
       <w:r>
@@ -6131,14 +6450,14 @@
         <w:pStyle w:val="Compact"/>
         <w:numPr>
           <w:ilvl w:val="0"/>
-          <w:numId w:val="1018"/>
+          <w:numId w:val="1019"/>
         </w:numPr>
       </w:pPr>
       <w:r>
         <w:t xml:space="preserve">sensible Agile adoption, working through the Agile manifesto, and cross-functional collaboration.</w:t>
       </w:r>
     </w:p>
-    <w:bookmarkEnd w:id="32"/>
+    <w:bookmarkEnd w:id="33"/>
     <w:sectPr>
       <w:footnotePr>
         <w:numRestart w:val="eachSect"/>
@@ -6546,6 +6865,9 @@
     <w:abstractNumId w:val="991"/>
   </w:num>
   <w:num w:numId="1018">
+    <w:abstractNumId w:val="991"/>
+  </w:num>
+  <w:num w:numId="1019">
     <w:abstractNumId w:val="991"/>
   </w:num>
 </w:numbering>

</xml_diff>